<commit_message>
Resize Figures 1-5 to JTM specs (170mm width, 300dpi, max 225mm height); update manuscript references
</commit_message>
<xml_diff>
--- a/Manuscript_JTM_v1.docx
+++ b/Manuscript_JTM_v1.docx
@@ -1881,14 +1881,14 @@
         </w:rPr>
         <w:drawing>
           <wp:inline>
-            <wp:extent cx="5334000" cy="4000499"/>
+            <wp:extent cx="5334000" cy="4000500"/>
             <wp:effectExtent b="0" l="0" r="0" t="0"/>
             <wp:docPr descr="Figure 1" title="" id="10" name="Picture"/>
             <a:graphic>
               <a:graphicData uri="http://schemas.openxmlformats.org/drawingml/2006/picture">
                 <pic:pic>
                   <pic:nvPicPr>
-                    <pic:cNvPr descr="figures/Figure2_Translation_Module_Identification.png" id="11" name="Picture"/>
+                    <pic:cNvPr descr="figures/Fig1_JTM.png" id="11" name="Picture"/>
                     <pic:cNvPicPr>
                       <a:picLocks noChangeArrowheads="1" noChangeAspect="1"/>
                     </pic:cNvPicPr>
@@ -1902,7 +1902,7 @@
                   <pic:spPr bwMode="auto">
                     <a:xfrm>
                       <a:off x="0" y="0"/>
-                      <a:ext cx="5334000" cy="4000499"/>
+                      <a:ext cx="5334000" cy="4000500"/>
                     </a:xfrm>
                     <a:prstGeom prst="rect">
                       <a:avLst/>
@@ -2703,14 +2703,14 @@
         </w:rPr>
         <w:drawing>
           <wp:inline>
-            <wp:extent cx="5334000" cy="4267200"/>
+            <wp:extent cx="5334000" cy="4266137"/>
             <wp:effectExtent b="0" l="0" r="0" t="0"/>
             <wp:docPr descr="Figure 2" title="" id="14" name="Picture"/>
             <a:graphic>
               <a:graphicData uri="http://schemas.openxmlformats.org/drawingml/2006/picture">
                 <pic:pic>
                   <pic:nvPicPr>
-                    <pic:cNvPr descr="figures/Figure_ssGSEA_cross_disease.png" id="15" name="Picture"/>
+                    <pic:cNvPr descr="figures/Fig2_JTM.png" id="15" name="Picture"/>
                     <pic:cNvPicPr>
                       <a:picLocks noChangeArrowheads="1" noChangeAspect="1"/>
                     </pic:cNvPicPr>
@@ -2724,7 +2724,7 @@
                   <pic:spPr bwMode="auto">
                     <a:xfrm>
                       <a:off x="0" y="0"/>
-                      <a:ext cx="5334000" cy="4267200"/>
+                      <a:ext cx="5334000" cy="4266137"/>
                     </a:xfrm>
                     <a:prstGeom prst="rect">
                       <a:avLst/>
@@ -3429,14 +3429,14 @@
         </w:rPr>
         <w:drawing>
           <wp:inline>
-            <wp:extent cx="5334000" cy="4572000"/>
+            <wp:extent cx="5334000" cy="4571620"/>
             <wp:effectExtent b="0" l="0" r="0" t="0"/>
             <wp:docPr descr="Figure 3" title="" id="18" name="Picture"/>
             <a:graphic>
               <a:graphicData uri="http://schemas.openxmlformats.org/drawingml/2006/picture">
                 <pic:pic>
                   <pic:nvPicPr>
-                    <pic:cNvPr descr="figures/Figure_S5_Validation_SameOrgan_Controls.png" id="19" name="Picture"/>
+                    <pic:cNvPr descr="figures/Fig3_JTM.png" id="19" name="Picture"/>
                     <pic:cNvPicPr>
                       <a:picLocks noChangeArrowheads="1" noChangeAspect="1"/>
                     </pic:cNvPicPr>
@@ -3450,7 +3450,7 @@
                   <pic:spPr bwMode="auto">
                     <a:xfrm>
                       <a:off x="0" y="0"/>
-                      <a:ext cx="5334000" cy="4572000"/>
+                      <a:ext cx="5334000" cy="4571620"/>
                     </a:xfrm>
                     <a:prstGeom prst="rect">
                       <a:avLst/>
@@ -3996,7 +3996,7 @@
               <a:graphicData uri="http://schemas.openxmlformats.org/drawingml/2006/picture">
                 <pic:pic>
                   <pic:nvPicPr>
-                    <pic:cNvPr descr="figures/Figure4_TATS_Validation.png" id="23" name="Picture"/>
+                    <pic:cNvPr descr="figures/Fig4_JTM.png" id="23" name="Picture"/>
                     <pic:cNvPicPr>
                       <a:picLocks noChangeArrowheads="1" noChangeAspect="1"/>
                     </pic:cNvPicPr>
@@ -4642,14 +4642,14 @@
         </w:rPr>
         <w:drawing>
           <wp:inline>
-            <wp:extent cx="5334000" cy="5067299"/>
+            <wp:extent cx="5334000" cy="5065706"/>
             <wp:effectExtent b="0" l="0" r="0" t="0"/>
             <wp:docPr descr="Figure 5" title="" id="26" name="Picture"/>
             <a:graphic>
               <a:graphicData uri="http://schemas.openxmlformats.org/drawingml/2006/picture">
                 <pic:pic>
                   <pic:nvPicPr>
-                    <pic:cNvPr descr="figures/Figure5_Combined.png" id="27" name="Picture"/>
+                    <pic:cNvPr descr="figures/Fig5_JTM.png" id="27" name="Picture"/>
                     <pic:cNvPicPr>
                       <a:picLocks noChangeArrowheads="1" noChangeAspect="1"/>
                     </pic:cNvPicPr>
@@ -4663,7 +4663,7 @@
                   <pic:spPr bwMode="auto">
                     <a:xfrm>
                       <a:off x="0" y="0"/>
-                      <a:ext cx="5334000" cy="5067299"/>
+                      <a:ext cx="5334000" cy="5065706"/>
                     </a:xfrm>
                     <a:prstGeom prst="rect">
                       <a:avLst/>

</xml_diff>

<commit_message>
Update AI disclosure (GPT-4 for language editing) and Data Availability (real GitHub URL)
</commit_message>
<xml_diff>
--- a/Manuscript_JTM_v1.docx
+++ b/Manuscript_JTM_v1.docx
@@ -7202,7 +7202,7 @@
           <w:color w:val="000000"/>
           <w:sz w:val="22"/>
         </w:rPr>
-        <w:t xml:space="preserve">No large language models or generative AI tools were used in the design, execution, analysis, or writing of this study. All data analyses, statistical tests, and manuscript composition were performed by the authors.</w:t>
+        <w:t xml:space="preserve">Generative AI tools (GPT-4) were used for English language editing and refinement of the manuscript text. No large language models or generative AI tools were used in the design, execution, or analysis of this study. All data analyses, statistical tests, and scientific conclusions were performed and verified by the authors, who assume full responsibility for the content of this manuscript.</w:t>
       </w:r>
     </w:p>
     <w:bookmarkEnd w:id="38"/>
@@ -7630,7 +7630,7 @@
           <w:color w:val="000000"/>
           <w:sz w:val="22"/>
         </w:rPr>
-        <w:t xml:space="preserve">Analysis code has been deposited in a GitHub repository and is accessible via an anonymous link during peer review: https://anonymous.4open.science/r/translation-mirror-hf-hcc-4622/. The repository (project name: translation-mirror-hf-hcc) contains the complete WGCNA, ssGSEA, TF correlation, and direction consistency analysis pipelines. Programming language: R and Python. License: MIT. Upon acceptance, the repository will be made publicly available and assigned a permanent DOI through Zenodo.</w:t>
+        <w:t xml:space="preserve">Analysis code is publicly available at https://github.com/zxy048/translation-mirror-hf-hcc (project name: translation-mirror-hf-hcc). The repository contains the complete WGCNA, ssGSEA, TF correlation, and direction consistency analysis pipelines. Programming language: R and Python. License: MIT. An archived version will be deposited in Zenodo with a permanent DOI upon acceptance.</w:t>
       </w:r>
     </w:p>
     <w:bookmarkEnd w:id="43"/>

</xml_diff>

<commit_message>
Move Availability of data and materials into Declarations section per BMC format
</commit_message>
<xml_diff>
--- a/Manuscript_JTM_v1.docx
+++ b/Manuscript_JTM_v1.docx
@@ -7587,54 +7587,7 @@
     </w:p>
     <w:bookmarkEnd w:id="41"/>
     <w:bookmarkEnd w:id="42"/>
-    <w:bookmarkStart w:id="43" w:name="availability-of-data-and-materials"/>
-    <w:p>
-      <w:pPr>
-        <w:pStyle w:val="Heading2"/>
-        <w:spacing w:line="480" w:lineRule="auto"/>
-      </w:pPr>
-      <w:r>
-        <w:rPr>
-          <w:rFonts w:ascii="Times New Roman" w:hAnsi="Times New Roman"/>
-          <w:b/>
-          <w:color w:val="000000"/>
-          <w:sz w:val="22"/>
-        </w:rPr>
-        <w:t xml:space="preserve">Availability of data and materials</w:t>
-      </w:r>
-    </w:p>
-    <w:p>
-      <w:pPr>
-        <w:pStyle w:val="FirstParagraph"/>
-        <w:spacing w:line="480" w:lineRule="auto"/>
-      </w:pPr>
-      <w:r>
-        <w:rPr>
-          <w:rFonts w:ascii="Times New Roman" w:hAnsi="Times New Roman"/>
-          <w:b w:val="0"/>
-          <w:color w:val="000000"/>
-          <w:sz w:val="22"/>
-        </w:rPr>
-        <w:t xml:space="preserve">All datasets used in this study are publicly available: GSE57338, GSE141198, GSE14520, and GSE76427 from the Gene Expression Omnibus (https://www.ncbi.nlm.nih.gov/geo/); TCGA-LIHC from the GDC Data Portal (https://portal.gdc.cancer.gov/).</w:t>
-      </w:r>
-    </w:p>
-    <w:p>
-      <w:pPr>
-        <w:pStyle w:val="BodyText"/>
-        <w:spacing w:line="480" w:lineRule="auto"/>
-      </w:pPr>
-      <w:r>
-        <w:rPr>
-          <w:rFonts w:ascii="Times New Roman" w:hAnsi="Times New Roman"/>
-          <w:b w:val="0"/>
-          <w:color w:val="000000"/>
-          <w:sz w:val="22"/>
-        </w:rPr>
-        <w:t xml:space="preserve">Analysis code is publicly available at https://github.com/zxy048/translation-mirror-hf-hcc (project name: translation-mirror-hf-hcc). The repository contains the complete WGCNA, ssGSEA, TF correlation, and direction consistency analysis pipelines. Programming language: R and Python. License: MIT. An archived version will be deposited in Zenodo with a permanent DOI upon acceptance.</w:t>
-      </w:r>
-    </w:p>
-    <w:bookmarkEnd w:id="43"/>
-    <w:bookmarkStart w:id="44" w:name="references"/>
+    <w:bookmarkStart w:id="43" w:name="references"/>
     <w:p>
       <w:pPr>
         <w:pStyle w:val="Heading2"/>
@@ -9366,24 +9319,56 @@
         <w:t xml:space="preserve">, 2131 (2023).</w:t>
       </w:r>
     </w:p>
+    <w:bookmarkEnd w:id="43"/>
+    <w:bookmarkStart w:id="51" w:name="declarations"/>
+    <w:p>
+      <w:pPr>
+        <w:pStyle w:val="Heading2"/>
+        <w:spacing w:line="480" w:lineRule="auto"/>
+      </w:pPr>
+      <w:r>
+        <w:rPr>
+          <w:rFonts w:ascii="Times New Roman" w:hAnsi="Times New Roman"/>
+          <w:b/>
+          <w:color w:val="000000"/>
+          <w:sz w:val="22"/>
+        </w:rPr>
+        <w:t xml:space="preserve">Declarations</w:t>
+      </w:r>
+    </w:p>
+    <w:bookmarkStart w:id="44" w:name="Xd182db0490b2de20bd2b4e4cc8698599182035f"/>
+    <w:p>
+      <w:pPr>
+        <w:pStyle w:val="Heading3"/>
+        <w:spacing w:line="480" w:lineRule="auto"/>
+      </w:pPr>
+      <w:r>
+        <w:rPr>
+          <w:rFonts w:ascii="Times New Roman" w:hAnsi="Times New Roman"/>
+          <w:b/>
+          <w:color w:val="000000"/>
+          <w:sz w:val="22"/>
+        </w:rPr>
+        <w:t xml:space="preserve">Ethics approval and consent to participate</w:t>
+      </w:r>
+    </w:p>
+    <w:p>
+      <w:pPr>
+        <w:pStyle w:val="FirstParagraph"/>
+        <w:spacing w:line="480" w:lineRule="auto"/>
+      </w:pPr>
+      <w:r>
+        <w:rPr>
+          <w:rFonts w:ascii="Times New Roman" w:hAnsi="Times New Roman"/>
+          <w:b w:val="0"/>
+          <w:color w:val="000000"/>
+          <w:sz w:val="22"/>
+        </w:rPr>
+        <w:t xml:space="preserve">All datasets used in this study are publicly available and were originally collected with informed consent and ethical approval as described in their respective publications. No new data involving human participants or animals were generated for this study.</w:t>
+      </w:r>
+    </w:p>
     <w:bookmarkEnd w:id="44"/>
-    <w:bookmarkStart w:id="51" w:name="declarations"/>
-    <w:p>
-      <w:pPr>
-        <w:pStyle w:val="Heading2"/>
-        <w:spacing w:line="480" w:lineRule="auto"/>
-      </w:pPr>
-      <w:r>
-        <w:rPr>
-          <w:rFonts w:ascii="Times New Roman" w:hAnsi="Times New Roman"/>
-          <w:b/>
-          <w:color w:val="000000"/>
-          <w:sz w:val="22"/>
-        </w:rPr>
-        <w:t xml:space="preserve">Declarations</w:t>
-      </w:r>
-    </w:p>
-    <w:bookmarkStart w:id="45" w:name="Xd182db0490b2de20bd2b4e4cc8698599182035f"/>
+    <w:bookmarkStart w:id="45" w:name="consent-for-publication"/>
     <w:p>
       <w:pPr>
         <w:pStyle w:val="Heading3"/>
@@ -9396,7 +9381,7 @@
           <w:color w:val="000000"/>
           <w:sz w:val="22"/>
         </w:rPr>
-        <w:t xml:space="preserve">Ethics approval and consent to participate</w:t>
+        <w:t xml:space="preserve">Consent for publication</w:t>
       </w:r>
     </w:p>
     <w:p>
@@ -9411,11 +9396,11 @@
           <w:color w:val="000000"/>
           <w:sz w:val="22"/>
         </w:rPr>
-        <w:t xml:space="preserve">All datasets used in this study are publicly available and were originally collected with informed consent and ethical approval as described in their respective publications. No new data involving human participants or animals were generated for this study.</w:t>
+        <w:t xml:space="preserve">Not applicable.</w:t>
       </w:r>
     </w:p>
     <w:bookmarkEnd w:id="45"/>
-    <w:bookmarkStart w:id="46" w:name="consent-for-publication"/>
+    <w:bookmarkStart w:id="46" w:name="availability-of-data-and-materials"/>
     <w:p>
       <w:pPr>
         <w:pStyle w:val="Heading3"/>
@@ -9428,7 +9413,7 @@
           <w:color w:val="000000"/>
           <w:sz w:val="22"/>
         </w:rPr>
-        <w:t xml:space="preserve">Consent for publication</w:t>
+        <w:t xml:space="preserve">Availability of data and materials</w:t>
       </w:r>
     </w:p>
     <w:p>
@@ -9443,7 +9428,7 @@
           <w:color w:val="000000"/>
           <w:sz w:val="22"/>
         </w:rPr>
-        <w:t xml:space="preserve">Not applicable.</w:t>
+        <w:t xml:space="preserve">All datasets used in this study are publicly available: GSE57338, GSE141198, GSE14520, and GSE76427 from the Gene Expression Omnibus (https://www.ncbi.nlm.nih.gov/geo/); TCGA-LIHC from the GDC Data Portal (https://portal.gdc.cancer.gov/). Analysis code is publicly available at https://github.com/zxy048/translation-mirror-hf-hcc (project name: translation-mirror-hf-hcc). The repository contains the complete WGCNA, ssGSEA, TF correlation, and direction consistency analysis pipelines. Programming language: R and Python. License: MIT. An archived version will be deposited in Zenodo with a permanent DOI upon acceptance.</w:t>
       </w:r>
     </w:p>
     <w:bookmarkEnd w:id="46"/>

</xml_diff>

<commit_message>
Distinguish lead corresponding (Junhong Wang*) vs co-corresponding (Xin Wu#)
</commit_message>
<xml_diff>
--- a/Manuscript_JTM_v1.docx
+++ b/Manuscript_JTM_v1.docx
@@ -102,47 +102,142 @@
           <w:color w:val="000000"/>
           <w:sz w:val="22"/>
         </w:rPr>
+        <w:t xml:space="preserve">3#</w:t>
+      </w:r>
+      <w:r>
+        <w:rPr>
+          <w:rFonts w:ascii="Times New Roman" w:hAnsi="Times New Roman"/>
+          <w:b w:val="0"/>
+          <w:color w:val="000000"/>
+          <w:sz w:val="22"/>
+        </w:rPr>
+        <w:t xml:space="preserve">, Junhong Wang</w:t>
+      </w:r>
+      <w:r>
+        <w:rPr>
+          <w:rFonts w:ascii="Times New Roman" w:hAnsi="Times New Roman"/>
+          <w:b w:val="0"/>
+          <w:color w:val="000000"/>
+          <w:sz w:val="22"/>
+        </w:rPr>
+        <w:t xml:space="preserve">1,2*</w:t>
+      </w:r>
+      <w:r>
+        <w:rPr>
+          <w:rFonts w:ascii="Times New Roman" w:hAnsi="Times New Roman"/>
+          <w:b w:val="0"/>
+          <w:color w:val="000000"/>
+          <w:sz w:val="22"/>
+        </w:rPr>
+        <w:t xml:space="preserve"> </w:t>
+      </w:r>
+      <w:r>
+        <w:rPr>
+          <w:rFonts w:ascii="Times New Roman" w:hAnsi="Times New Roman"/>
+          <w:b w:val="0"/>
+          <w:color w:val="000000"/>
+          <w:sz w:val="22"/>
+        </w:rPr>
+        <w:t xml:space="preserve">(ORCID: 0000-0003-2314-1810)</w:t>
+      </w:r>
+    </w:p>
+    <w:p>
+      <w:pPr>
+        <w:pStyle w:val="BodyText"/>
+        <w:spacing w:line="480" w:lineRule="auto"/>
+      </w:pPr>
+      <w:r>
+        <w:rPr>
+          <w:rFonts w:ascii="Times New Roman" w:hAnsi="Times New Roman"/>
+          <w:b w:val="0"/>
+          <w:color w:val="000000"/>
+          <w:sz w:val="22"/>
+        </w:rPr>
+        <w:t xml:space="preserve">1</w:t>
+      </w:r>
+      <w:r>
+        <w:rPr>
+          <w:rFonts w:ascii="Times New Roman" w:hAnsi="Times New Roman"/>
+          <w:b w:val="0"/>
+          <w:color w:val="000000"/>
+          <w:sz w:val="22"/>
+        </w:rPr>
+        <w:t xml:space="preserve"> </w:t>
+      </w:r>
+      <w:r>
+        <w:rPr>
+          <w:rFonts w:ascii="Times New Roman" w:hAnsi="Times New Roman"/>
+          <w:b w:val="0"/>
+          <w:color w:val="000000"/>
+          <w:sz w:val="22"/>
+        </w:rPr>
+        <w:t xml:space="preserve">Department of Cardiology, The First Affiliated Hospital of Nanjing Medical University, Nanjing, China</w:t>
+      </w:r>
+    </w:p>
+    <w:p>
+      <w:pPr>
+        <w:pStyle w:val="BodyText"/>
+        <w:spacing w:line="480" w:lineRule="auto"/>
+      </w:pPr>
+      <w:r>
+        <w:rPr>
+          <w:rFonts w:ascii="Times New Roman" w:hAnsi="Times New Roman"/>
+          <w:b w:val="0"/>
+          <w:color w:val="000000"/>
+          <w:sz w:val="22"/>
+        </w:rPr>
+        <w:t xml:space="preserve">2</w:t>
+      </w:r>
+      <w:r>
+        <w:rPr>
+          <w:rFonts w:ascii="Times New Roman" w:hAnsi="Times New Roman"/>
+          <w:b w:val="0"/>
+          <w:color w:val="000000"/>
+          <w:sz w:val="22"/>
+        </w:rPr>
+        <w:t xml:space="preserve"> </w:t>
+      </w:r>
+      <w:r>
+        <w:rPr>
+          <w:rFonts w:ascii="Times New Roman" w:hAnsi="Times New Roman"/>
+          <w:b w:val="0"/>
+          <w:color w:val="000000"/>
+          <w:sz w:val="22"/>
+        </w:rPr>
+        <w:t xml:space="preserve">Department of Cardiology, Liyang People’s Hospital, Liyang, China</w:t>
+      </w:r>
+    </w:p>
+    <w:p>
+      <w:pPr>
+        <w:pStyle w:val="BodyText"/>
+        <w:spacing w:line="480" w:lineRule="auto"/>
+      </w:pPr>
+      <w:r>
+        <w:rPr>
+          <w:rFonts w:ascii="Times New Roman" w:hAnsi="Times New Roman"/>
+          <w:b w:val="0"/>
+          <w:color w:val="000000"/>
+          <w:sz w:val="22"/>
+        </w:rPr>
         <w:t xml:space="preserve">3</w:t>
       </w:r>
       <w:r>
         <w:rPr>
           <w:rFonts w:ascii="Times New Roman" w:hAnsi="Times New Roman"/>
           <w:b w:val="0"/>
-          <w:i/>
-          <w:iCs/>
-          <w:color w:val="000000"/>
-          <w:sz w:val="22"/>
-        </w:rPr>
-        <w:t xml:space="preserve">, Junhong Wang</w:t>
-      </w:r>
-      <w:r>
-        <w:rPr>
-          <w:rFonts w:ascii="Times New Roman" w:hAnsi="Times New Roman"/>
-          <w:b w:val="0"/>
-          <w:i/>
-          <w:iCs/>
-          <w:color w:val="000000"/>
-          <w:sz w:val="22"/>
-        </w:rPr>
-        <w:t xml:space="preserve">1,2</w:t>
-      </w:r>
-      <w:r>
-        <w:rPr>
-          <w:rFonts w:ascii="Times New Roman" w:hAnsi="Times New Roman"/>
-          <w:b w:val="0"/>
-          <w:color w:val="000000"/>
-          <w:sz w:val="22"/>
-        </w:rPr>
-        <w:t xml:space="preserve"> </w:t>
-      </w:r>
-      <w:r>
-        <w:rPr>
-          <w:rFonts w:ascii="Times New Roman" w:hAnsi="Times New Roman"/>
-          <w:b w:val="0"/>
-          <w:color w:val="000000"/>
-          <w:sz w:val="22"/>
-        </w:rPr>
-        <w:t xml:space="preserve">(ORCID: 0000-0003-2314-1810)</w:t>
+          <w:color w:val="000000"/>
+          <w:sz w:val="22"/>
+        </w:rPr>
+        <w:t xml:space="preserve"> </w:t>
+      </w:r>
+      <w:r>
+        <w:rPr>
+          <w:rFonts w:ascii="Times New Roman" w:hAnsi="Times New Roman"/>
+          <w:b w:val="0"/>
+          <w:color w:val="000000"/>
+          <w:sz w:val="22"/>
+        </w:rPr>
+        <w:t xml:space="preserve">Department of Reproduction Medicine, The First Affiliated Hospital of Nanjing Medical University, Nanjing, China</w:t>
       </w:r>
     </w:p>
     <w:p>
@@ -157,25 +252,25 @@
           <w:color w:val="000000"/>
           <w:sz w:val="22"/>
         </w:rPr>
-        <w:t xml:space="preserve">1</w:t>
-      </w:r>
-      <w:r>
-        <w:rPr>
-          <w:rFonts w:ascii="Times New Roman" w:hAnsi="Times New Roman"/>
-          <w:b w:val="0"/>
-          <w:color w:val="000000"/>
-          <w:sz w:val="22"/>
-        </w:rPr>
-        <w:t xml:space="preserve"> </w:t>
-      </w:r>
-      <w:r>
-        <w:rPr>
-          <w:rFonts w:ascii="Times New Roman" w:hAnsi="Times New Roman"/>
-          <w:b w:val="0"/>
-          <w:color w:val="000000"/>
-          <w:sz w:val="22"/>
-        </w:rPr>
-        <w:t xml:space="preserve">Department of Cardiology, The First Affiliated Hospital of Nanjing Medical University, Nanjing, China</w:t>
+        <w:t xml:space="preserve">*</w:t>
+      </w:r>
+      <w:r>
+        <w:rPr>
+          <w:rFonts w:ascii="Times New Roman" w:hAnsi="Times New Roman"/>
+          <w:b w:val="0"/>
+          <w:color w:val="000000"/>
+          <w:sz w:val="22"/>
+        </w:rPr>
+        <w:t xml:space="preserve"> </w:t>
+      </w:r>
+      <w:r>
+        <w:rPr>
+          <w:rFonts w:ascii="Times New Roman" w:hAnsi="Times New Roman"/>
+          <w:b w:val="0"/>
+          <w:color w:val="000000"/>
+          <w:sz w:val="22"/>
+        </w:rPr>
+        <w:t xml:space="preserve">Lead corresponding author. Email: wangjunhong@jsph.org.cn</w:t>
       </w:r>
     </w:p>
     <w:p>
@@ -190,91 +285,25 @@
           <w:color w:val="000000"/>
           <w:sz w:val="22"/>
         </w:rPr>
-        <w:t xml:space="preserve">2</w:t>
-      </w:r>
-      <w:r>
-        <w:rPr>
-          <w:rFonts w:ascii="Times New Roman" w:hAnsi="Times New Roman"/>
-          <w:b w:val="0"/>
-          <w:color w:val="000000"/>
-          <w:sz w:val="22"/>
-        </w:rPr>
-        <w:t xml:space="preserve"> </w:t>
-      </w:r>
-      <w:r>
-        <w:rPr>
-          <w:rFonts w:ascii="Times New Roman" w:hAnsi="Times New Roman"/>
-          <w:b w:val="0"/>
-          <w:color w:val="000000"/>
-          <w:sz w:val="22"/>
-        </w:rPr>
-        <w:t xml:space="preserve">Department of Cardiology, Liyang People’s Hospital, Liyang, China</w:t>
-      </w:r>
-    </w:p>
-    <w:p>
-      <w:pPr>
-        <w:pStyle w:val="BodyText"/>
-        <w:spacing w:line="480" w:lineRule="auto"/>
-      </w:pPr>
-      <w:r>
-        <w:rPr>
-          <w:rFonts w:ascii="Times New Roman" w:hAnsi="Times New Roman"/>
-          <w:b w:val="0"/>
-          <w:color w:val="000000"/>
-          <w:sz w:val="22"/>
-        </w:rPr>
-        <w:t xml:space="preserve">3</w:t>
-      </w:r>
-      <w:r>
-        <w:rPr>
-          <w:rFonts w:ascii="Times New Roman" w:hAnsi="Times New Roman"/>
-          <w:b w:val="0"/>
-          <w:color w:val="000000"/>
-          <w:sz w:val="22"/>
-        </w:rPr>
-        <w:t xml:space="preserve"> </w:t>
-      </w:r>
-      <w:r>
-        <w:rPr>
-          <w:rFonts w:ascii="Times New Roman" w:hAnsi="Times New Roman"/>
-          <w:b w:val="0"/>
-          <w:color w:val="000000"/>
-          <w:sz w:val="22"/>
-        </w:rPr>
-        <w:t xml:space="preserve">Department of Reproduction Medicine, The First Affiliated Hospital of Nanjing Medical University, Nanjing, China</w:t>
-      </w:r>
-    </w:p>
-    <w:p>
-      <w:pPr>
-        <w:pStyle w:val="BodyText"/>
-        <w:spacing w:line="480" w:lineRule="auto"/>
-      </w:pPr>
-      <w:r>
-        <w:rPr>
-          <w:rFonts w:ascii="Times New Roman" w:hAnsi="Times New Roman"/>
-          <w:b w:val="0"/>
-          <w:color w:val="000000"/>
-          <w:sz w:val="22"/>
-        </w:rPr>
-        <w:t xml:space="preserve">*</w:t>
-      </w:r>
-      <w:r>
-        <w:rPr>
-          <w:rFonts w:ascii="Times New Roman" w:hAnsi="Times New Roman"/>
-          <w:b w:val="0"/>
-          <w:color w:val="000000"/>
-          <w:sz w:val="22"/>
-        </w:rPr>
-        <w:t xml:space="preserve"> </w:t>
-      </w:r>
-      <w:r>
-        <w:rPr>
-          <w:rFonts w:ascii="Times New Roman" w:hAnsi="Times New Roman"/>
-          <w:b w:val="0"/>
-          <w:color w:val="000000"/>
-          <w:sz w:val="22"/>
-        </w:rPr>
-        <w:t xml:space="preserve">Co-corresponding authors. Email: wuxin0220@aliyun.com (X.W.); wangjunhong@jsph.org.cn (J.W.)</w:t>
+        <w:t xml:space="preserve">#</w:t>
+      </w:r>
+      <w:r>
+        <w:rPr>
+          <w:rFonts w:ascii="Times New Roman" w:hAnsi="Times New Roman"/>
+          <w:b w:val="0"/>
+          <w:color w:val="000000"/>
+          <w:sz w:val="22"/>
+        </w:rPr>
+        <w:t xml:space="preserve"> </w:t>
+      </w:r>
+      <w:r>
+        <w:rPr>
+          <w:rFonts w:ascii="Times New Roman" w:hAnsi="Times New Roman"/>
+          <w:b w:val="0"/>
+          <w:color w:val="000000"/>
+          <w:sz w:val="22"/>
+        </w:rPr>
+        <w:t xml:space="preserve">Co-corresponding author. Email: wuxin0220@aliyun.com</w:t>
       </w:r>
     </w:p>
     <w:p>

</xml_diff>

<commit_message>
Restructure abstract per JTM requirements (Background/Methods/Results/Conclusions/Trial registration)
</commit_message>
<xml_diff>
--- a/Manuscript_JTM_v1.docx
+++ b/Manuscript_JTM_v1.docx
@@ -335,8 +335,32 @@
           <w:color w:val="000000"/>
           <w:sz w:val="22"/>
         </w:rPr>
-        <w:t xml:space="preserve">Heart failure (HF) and hepatocellular carcinoma (HCC) both exhibit dysregulation of translation-related gene expression, yet whether this reflects shared transcriptional organization or disease-specific remodeling remains unresolved. Here we show that translation-related transcriptional programs in HF and HCC are organized through disease-specific co-expression networks, yet converge on opposite-direction pathway perturbation. Weighted gene co-expression network analysis of HF (GSE57338,</w:t>
-      </w:r>
+        <w:t xml:space="preserve">Background:</w:t>
+      </w:r>
+      <w:r>
+        <w:rPr>
+          <w:rFonts w:ascii="Times New Roman" w:hAnsi="Times New Roman"/>
+          <w:b w:val="0"/>
+          <w:color w:val="000000"/>
+          <w:sz w:val="22"/>
+        </w:rPr>
+        <w:t xml:space="preserve"> </w:t>
+      </w:r>
+      <w:r>
+        <w:rPr>
+          <w:rFonts w:ascii="Times New Roman" w:hAnsi="Times New Roman"/>
+          <w:b w:val="0"/>
+          <w:color w:val="000000"/>
+          <w:sz w:val="22"/>
+        </w:rPr>
+        <w:t xml:space="preserve">Heart failure (HF) and hepatocellular carcinoma (HCC) both exhibit dysregulation of translation-related gene expression, yet whether this reflects shared transcriptional organization or disease-specific remodeling remains unresolved.</w:t>
+      </w:r>
+    </w:p>
+    <w:p>
+      <w:pPr>
+        <w:pStyle w:val="BodyText"/>
+        <w:spacing w:line="480" w:lineRule="auto"/>
+      </w:pPr>
       <w:r>
         <w:rPr>
           <w:rFonts w:ascii="Times New Roman" w:hAnsi="Times New Roman"/>
@@ -345,20 +369,294 @@
           <w:color w:val="000000"/>
           <w:sz w:val="22"/>
         </w:rPr>
-        <w:t xml:space="preserve"> </w:t>
-      </w:r>
+        <w:t xml:space="preserve">Methods:</w:t>
+      </w:r>
+      <w:r>
+        <w:rPr>
+          <w:rFonts w:ascii="Times New Roman" w:hAnsi="Times New Roman"/>
+          <w:b w:val="0"/>
+          <w:color w:val="000000"/>
+          <w:sz w:val="22"/>
+        </w:rPr>
+        <w:t xml:space="preserve"> </w:t>
+      </w:r>
+      <w:r>
+        <w:rPr>
+          <w:rFonts w:ascii="Times New Roman" w:hAnsi="Times New Roman"/>
+          <w:b w:val="0"/>
+          <w:color w:val="000000"/>
+          <w:sz w:val="22"/>
+        </w:rPr>
+        <w:t xml:space="preserve">We performed weighted gene co-expression network analysis (WGCNA) on HF left ventricular myocardium (GSE57338,</w:t>
+      </w:r>
+      <w:r>
+        <w:rPr>
+          <w:rFonts w:ascii="Times New Roman" w:hAnsi="Times New Roman"/>
+          <w:b w:val="0"/>
+          <w:color w:val="000000"/>
+          <w:sz w:val="22"/>
+        </w:rPr>
+        <w:t xml:space="preserve"> </w:t>
+      </w:r>
+      <w:r>
+        <w:rPr>
+          <w:rFonts w:ascii="Times New Roman" w:hAnsi="Times New Roman"/>
+          <w:b w:val="0"/>
+          <w:i/>
+          <w:iCs/>
+          <w:color w:val="000000"/>
+          <w:sz w:val="22"/>
+        </w:rPr>
+        <w:t xml:space="preserve">n</w:t>
+      </w:r>
+      <w:r>
+        <w:rPr>
+          <w:rFonts w:ascii="Times New Roman" w:hAnsi="Times New Roman"/>
+          <w:b w:val="0"/>
+          <w:color w:val="000000"/>
+          <w:sz w:val="22"/>
+        </w:rPr>
+        <w:t xml:space="preserve"> </w:t>
+      </w:r>
+      <w:r>
+        <w:rPr>
+          <w:rFonts w:ascii="Times New Roman" w:hAnsi="Times New Roman"/>
+          <w:b w:val="0"/>
+          <w:color w:val="000000"/>
+          <w:sz w:val="22"/>
+        </w:rPr>
+        <w:t xml:space="preserve">= 313) and HCC tumor transcriptomes (GSE141198,</w:t>
+      </w:r>
+      <w:r>
+        <w:rPr>
+          <w:rFonts w:ascii="Times New Roman" w:hAnsi="Times New Roman"/>
+          <w:b w:val="0"/>
+          <w:color w:val="000000"/>
+          <w:sz w:val="22"/>
+        </w:rPr>
+        <w:t xml:space="preserve"> </w:t>
+      </w:r>
+      <w:r>
+        <w:rPr>
+          <w:rFonts w:ascii="Times New Roman" w:hAnsi="Times New Roman"/>
+          <w:b w:val="0"/>
+          <w:i/>
+          <w:iCs/>
+          <w:color w:val="000000"/>
+          <w:sz w:val="22"/>
+        </w:rPr>
+        <w:t xml:space="preserve">n</w:t>
+      </w:r>
+      <w:r>
+        <w:rPr>
+          <w:rFonts w:ascii="Times New Roman" w:hAnsi="Times New Roman"/>
+          <w:b w:val="0"/>
+          <w:color w:val="000000"/>
+          <w:sz w:val="22"/>
+        </w:rPr>
+        <w:t xml:space="preserve"> </w:t>
+      </w:r>
+      <w:r>
+        <w:rPr>
+          <w:rFonts w:ascii="Times New Roman" w:hAnsi="Times New Roman"/>
+          <w:b w:val="0"/>
+          <w:color w:val="000000"/>
+          <w:sz w:val="22"/>
+        </w:rPr>
+        <w:t xml:space="preserve">= 148), single-sample gene set enrichment analysis (ssGSEA) across 81 pathways, and systematic transcription factor (TF)–translation-associated transcriptional score (TATS) correlation analysis. Same-organ disease controls (hypertrophic cardiomyopathy, GSE141910; cirrhosis, GSE89377) and an independent HF cohort (GSE116250,</w:t>
+      </w:r>
+      <w:r>
+        <w:rPr>
+          <w:rFonts w:ascii="Times New Roman" w:hAnsi="Times New Roman"/>
+          <w:b w:val="0"/>
+          <w:color w:val="000000"/>
+          <w:sz w:val="22"/>
+        </w:rPr>
+        <w:t xml:space="preserve"> </w:t>
+      </w:r>
+      <w:r>
+        <w:rPr>
+          <w:rFonts w:ascii="Times New Roman" w:hAnsi="Times New Roman"/>
+          <w:b w:val="0"/>
+          <w:i/>
+          <w:iCs/>
+          <w:color w:val="000000"/>
+          <w:sz w:val="22"/>
+        </w:rPr>
+        <w:t xml:space="preserve">n</w:t>
+      </w:r>
+      <w:r>
+        <w:rPr>
+          <w:rFonts w:ascii="Times New Roman" w:hAnsi="Times New Roman"/>
+          <w:b w:val="0"/>
+          <w:color w:val="000000"/>
+          <w:sz w:val="22"/>
+        </w:rPr>
+        <w:t xml:space="preserve"> </w:t>
+      </w:r>
+      <w:r>
+        <w:rPr>
+          <w:rFonts w:ascii="Times New Roman" w:hAnsi="Times New Roman"/>
+          <w:b w:val="0"/>
+          <w:color w:val="000000"/>
+          <w:sz w:val="22"/>
+        </w:rPr>
+        <w:t xml:space="preserve">= 64) were analyzed to assess disease-context dependence.</w:t>
+      </w:r>
+    </w:p>
+    <w:p>
+      <w:pPr>
+        <w:pStyle w:val="BodyText"/>
+        <w:spacing w:line="480" w:lineRule="auto"/>
+      </w:pPr>
       <w:r>
         <w:rPr>
           <w:rFonts w:ascii="Times New Roman" w:hAnsi="Times New Roman"/>
           <w:b w:val="0"/>
           <w:bCs/>
-          <w:i/>
-          <w:iCs/>
-          <w:color w:val="000000"/>
-          <w:sz w:val="22"/>
-        </w:rPr>
-        <w:t xml:space="preserve">n</w:t>
-      </w:r>
+          <w:color w:val="000000"/>
+          <w:sz w:val="22"/>
+        </w:rPr>
+        <w:t xml:space="preserve">Results:</w:t>
+      </w:r>
+      <w:r>
+        <w:rPr>
+          <w:rFonts w:ascii="Times New Roman" w:hAnsi="Times New Roman"/>
+          <w:b w:val="0"/>
+          <w:color w:val="000000"/>
+          <w:sz w:val="22"/>
+        </w:rPr>
+        <w:t xml:space="preserve"> </w:t>
+      </w:r>
+      <w:r>
+        <w:rPr>
+          <w:rFonts w:ascii="Times New Roman" w:hAnsi="Times New Roman"/>
+          <w:b w:val="0"/>
+          <w:color w:val="000000"/>
+          <w:sz w:val="22"/>
+        </w:rPr>
+        <w:t xml:space="preserve">Translation-related modules identified in HF (green module, 227 genes, ribosome biogenesis) and HCC (blue module, 1,315 genes, cytoplasmic translation) showed limited gene-level overlap (62/227 genes; Fisher’s OR = 1.7,</w:t>
+      </w:r>
+      <w:r>
+        <w:rPr>
+          <w:rFonts w:ascii="Times New Roman" w:hAnsi="Times New Roman"/>
+          <w:b w:val="0"/>
+          <w:color w:val="000000"/>
+          <w:sz w:val="22"/>
+        </w:rPr>
+        <w:t xml:space="preserve"> </w:t>
+      </w:r>
+      <w:r>
+        <w:rPr>
+          <w:rFonts w:ascii="Times New Roman" w:hAnsi="Times New Roman"/>
+          <w:b w:val="0"/>
+          <w:i/>
+          <w:iCs/>
+          <w:color w:val="000000"/>
+          <w:sz w:val="22"/>
+        </w:rPr>
+        <w:t xml:space="preserve">P</w:t>
+      </w:r>
+      <w:r>
+        <w:rPr>
+          <w:rFonts w:ascii="Times New Roman" w:hAnsi="Times New Roman"/>
+          <w:b w:val="0"/>
+          <w:color w:val="000000"/>
+          <w:sz w:val="22"/>
+        </w:rPr>
+        <w:t xml:space="preserve"> </w:t>
+      </w:r>
+      <w:r>
+        <w:rPr>
+          <w:rFonts w:ascii="Times New Roman" w:hAnsi="Times New Roman"/>
+          <w:b w:val="0"/>
+          <w:color w:val="000000"/>
+          <w:sz w:val="22"/>
+        </w:rPr>
+        <w:t xml:space="preserve">= 0.039). Despite distinct network architecture, 24 of 33 translation-related pathways exhibited mirror perturbation between diseases (Spearman ρ = −0.598,</w:t>
+      </w:r>
+      <w:r>
+        <w:rPr>
+          <w:rFonts w:ascii="Times New Roman" w:hAnsi="Times New Roman"/>
+          <w:b w:val="0"/>
+          <w:color w:val="000000"/>
+          <w:sz w:val="22"/>
+        </w:rPr>
+        <w:t xml:space="preserve"> </w:t>
+      </w:r>
+      <w:r>
+        <w:rPr>
+          <w:rFonts w:ascii="Times New Roman" w:hAnsi="Times New Roman"/>
+          <w:b w:val="0"/>
+          <w:i/>
+          <w:iCs/>
+          <w:color w:val="000000"/>
+          <w:sz w:val="22"/>
+        </w:rPr>
+        <w:t xml:space="preserve">P</w:t>
+      </w:r>
+      <w:r>
+        <w:rPr>
+          <w:rFonts w:ascii="Times New Roman" w:hAnsi="Times New Roman"/>
+          <w:b w:val="0"/>
+          <w:color w:val="000000"/>
+          <w:sz w:val="22"/>
+        </w:rPr>
+        <w:t xml:space="preserve"> </w:t>
+      </w:r>
+      <w:r>
+        <w:rPr>
+          <w:rFonts w:ascii="Times New Roman" w:hAnsi="Times New Roman"/>
+          <w:b w:val="0"/>
+          <w:color w:val="000000"/>
+          <w:sz w:val="22"/>
+        </w:rPr>
+        <w:t xml:space="preserve">= 0.0003). This mirror pattern was absent in same-organ disease controls (hypertrophic cardiomyopathy, ρ = −0.036; cirrhosis, ρ = +0.402). ATF4 was the strongest individual TF correlate with TATS (ρ = +0.500, FDR &lt; 0.0001), while MYC target pathway activity showed the highest overall association (ρ = +0.753,</w:t>
+      </w:r>
+      <w:r>
+        <w:rPr>
+          <w:rFonts w:ascii="Times New Roman" w:hAnsi="Times New Roman"/>
+          <w:b w:val="0"/>
+          <w:color w:val="000000"/>
+          <w:sz w:val="22"/>
+        </w:rPr>
+        <w:t xml:space="preserve"> </w:t>
+      </w:r>
+      <w:r>
+        <w:rPr>
+          <w:rFonts w:ascii="Times New Roman" w:hAnsi="Times New Roman"/>
+          <w:b w:val="0"/>
+          <w:i/>
+          <w:iCs/>
+          <w:color w:val="000000"/>
+          <w:sz w:val="22"/>
+        </w:rPr>
+        <w:t xml:space="preserve">P</w:t>
+      </w:r>
+      <w:r>
+        <w:rPr>
+          <w:rFonts w:ascii="Times New Roman" w:hAnsi="Times New Roman"/>
+          <w:b w:val="0"/>
+          <w:color w:val="000000"/>
+          <w:sz w:val="22"/>
+        </w:rPr>
+        <w:t xml:space="preserve"> </w:t>
+      </w:r>
+      <w:r>
+        <w:rPr>
+          <w:rFonts w:ascii="Times New Roman" w:hAnsi="Times New Roman"/>
+          <w:b w:val="0"/>
+          <w:color w:val="000000"/>
+          <w:sz w:val="22"/>
+        </w:rPr>
+        <w:t xml:space="preserve">&lt; 0.0001).</w:t>
+      </w:r>
+    </w:p>
+    <w:p>
+      <w:pPr>
+        <w:pStyle w:val="BodyText"/>
+        <w:spacing w:line="480" w:lineRule="auto"/>
+      </w:pPr>
       <w:r>
         <w:rPr>
           <w:rFonts w:ascii="Times New Roman" w:hAnsi="Times New Roman"/>
@@ -367,8 +665,32 @@
           <w:color w:val="000000"/>
           <w:sz w:val="22"/>
         </w:rPr>
-        <w:t xml:space="preserve"> </w:t>
-      </w:r>
+        <w:t xml:space="preserve">Conclusions:</w:t>
+      </w:r>
+      <w:r>
+        <w:rPr>
+          <w:rFonts w:ascii="Times New Roman" w:hAnsi="Times New Roman"/>
+          <w:b w:val="0"/>
+          <w:color w:val="000000"/>
+          <w:sz w:val="22"/>
+        </w:rPr>
+        <w:t xml:space="preserve"> </w:t>
+      </w:r>
+      <w:r>
+        <w:rPr>
+          <w:rFonts w:ascii="Times New Roman" w:hAnsi="Times New Roman"/>
+          <w:b w:val="0"/>
+          <w:color w:val="000000"/>
+          <w:sz w:val="22"/>
+        </w:rPr>
+        <w:t xml:space="preserve">Translation-related transcriptional programs are organized through disease-specific co-expression networks yet converge on opposite-direction pathway perturbation. These findings identify disease-context-dependent remodeling — shared functional themes emerging through distinct network configurations with opposite perturbation directions — as an organizing principle of translation-related transcriptional programs across diseases.</w:t>
+      </w:r>
+    </w:p>
+    <w:p>
+      <w:pPr>
+        <w:pStyle w:val="BodyText"/>
+        <w:spacing w:line="480" w:lineRule="auto"/>
+      </w:pPr>
       <w:r>
         <w:rPr>
           <w:rFonts w:ascii="Times New Roman" w:hAnsi="Times New Roman"/>
@@ -377,175 +699,25 @@
           <w:color w:val="000000"/>
           <w:sz w:val="22"/>
         </w:rPr>
-        <w:t xml:space="preserve">= 313) and HCC (GSE141198,</w:t>
-      </w:r>
-      <w:r>
-        <w:rPr>
-          <w:rFonts w:ascii="Times New Roman" w:hAnsi="Times New Roman"/>
-          <w:b w:val="0"/>
-          <w:bCs/>
-          <w:color w:val="000000"/>
-          <w:sz w:val="22"/>
-        </w:rPr>
-        <w:t xml:space="preserve"> </w:t>
-      </w:r>
-      <w:r>
-        <w:rPr>
-          <w:rFonts w:ascii="Times New Roman" w:hAnsi="Times New Roman"/>
-          <w:b w:val="0"/>
-          <w:bCs/>
-          <w:i/>
-          <w:iCs/>
-          <w:color w:val="000000"/>
-          <w:sz w:val="22"/>
-        </w:rPr>
-        <w:t xml:space="preserve">n</w:t>
-      </w:r>
-      <w:r>
-        <w:rPr>
-          <w:rFonts w:ascii="Times New Roman" w:hAnsi="Times New Roman"/>
-          <w:b w:val="0"/>
-          <w:bCs/>
-          <w:color w:val="000000"/>
-          <w:sz w:val="22"/>
-        </w:rPr>
-        <w:t xml:space="preserve"> </w:t>
-      </w:r>
-      <w:r>
-        <w:rPr>
-          <w:rFonts w:ascii="Times New Roman" w:hAnsi="Times New Roman"/>
-          <w:b w:val="0"/>
-          <w:bCs/>
-          <w:color w:val="000000"/>
-          <w:sz w:val="22"/>
-        </w:rPr>
-        <w:t xml:space="preserve">= 148) transcriptomes identified translation-related modules with limited gene-level overlap (62/227 genes; Fisher’s OR = 1.7,</w:t>
-      </w:r>
-      <w:r>
-        <w:rPr>
-          <w:rFonts w:ascii="Times New Roman" w:hAnsi="Times New Roman"/>
-          <w:b w:val="0"/>
-          <w:bCs/>
-          <w:color w:val="000000"/>
-          <w:sz w:val="22"/>
-        </w:rPr>
-        <w:t xml:space="preserve"> </w:t>
-      </w:r>
-      <w:r>
-        <w:rPr>
-          <w:rFonts w:ascii="Times New Roman" w:hAnsi="Times New Roman"/>
-          <w:b w:val="0"/>
-          <w:bCs/>
-          <w:i/>
-          <w:iCs/>
-          <w:color w:val="000000"/>
-          <w:sz w:val="22"/>
-        </w:rPr>
-        <w:t xml:space="preserve">P</w:t>
-      </w:r>
-      <w:r>
-        <w:rPr>
-          <w:rFonts w:ascii="Times New Roman" w:hAnsi="Times New Roman"/>
-          <w:b w:val="0"/>
-          <w:bCs/>
-          <w:color w:val="000000"/>
-          <w:sz w:val="22"/>
-        </w:rPr>
-        <w:t xml:space="preserve"> </w:t>
-      </w:r>
-      <w:r>
-        <w:rPr>
-          <w:rFonts w:ascii="Times New Roman" w:hAnsi="Times New Roman"/>
-          <w:b w:val="0"/>
-          <w:bCs/>
-          <w:color w:val="000000"/>
-          <w:sz w:val="22"/>
-        </w:rPr>
-        <w:t xml:space="preserve">= 0.039). Despite distinct network architecture, 24 of 33 translation-related pathways showed mirror perturbation between diseases (Spearman ρ = −0.598,</w:t>
-      </w:r>
-      <w:r>
-        <w:rPr>
-          <w:rFonts w:ascii="Times New Roman" w:hAnsi="Times New Roman"/>
-          <w:b w:val="0"/>
-          <w:bCs/>
-          <w:color w:val="000000"/>
-          <w:sz w:val="22"/>
-        </w:rPr>
-        <w:t xml:space="preserve"> </w:t>
-      </w:r>
-      <w:r>
-        <w:rPr>
-          <w:rFonts w:ascii="Times New Roman" w:hAnsi="Times New Roman"/>
-          <w:b w:val="0"/>
-          <w:bCs/>
-          <w:i/>
-          <w:iCs/>
-          <w:color w:val="000000"/>
-          <w:sz w:val="22"/>
-        </w:rPr>
-        <w:t xml:space="preserve">P</w:t>
-      </w:r>
-      <w:r>
-        <w:rPr>
-          <w:rFonts w:ascii="Times New Roman" w:hAnsi="Times New Roman"/>
-          <w:b w:val="0"/>
-          <w:bCs/>
-          <w:color w:val="000000"/>
-          <w:sz w:val="22"/>
-        </w:rPr>
-        <w:t xml:space="preserve"> </w:t>
-      </w:r>
-      <w:r>
-        <w:rPr>
-          <w:rFonts w:ascii="Times New Roman" w:hAnsi="Times New Roman"/>
-          <w:b w:val="0"/>
-          <w:bCs/>
-          <w:color w:val="000000"/>
-          <w:sz w:val="22"/>
-        </w:rPr>
-        <w:t xml:space="preserve">= 0.0003). This mirror pattern was absent in same-organ disease controls, including hypertrophic cardiomyopathy (ρ = −0.036) and cirrhosis (ρ = +0.402), supporting disease-context dependence rather than organ-specific confounding. ATF4 was the strongest individual transcription factor correlate with translational activity (ρ = +0.500, FDR &lt; 0.0001), while MYC target pathway activity showed the highest overall association (ρ = +0.753,</w:t>
-      </w:r>
-      <w:r>
-        <w:rPr>
-          <w:rFonts w:ascii="Times New Roman" w:hAnsi="Times New Roman"/>
-          <w:b w:val="0"/>
-          <w:bCs/>
-          <w:color w:val="000000"/>
-          <w:sz w:val="22"/>
-        </w:rPr>
-        <w:t xml:space="preserve"> </w:t>
-      </w:r>
-      <w:r>
-        <w:rPr>
-          <w:rFonts w:ascii="Times New Roman" w:hAnsi="Times New Roman"/>
-          <w:b w:val="0"/>
-          <w:bCs/>
-          <w:i/>
-          <w:iCs/>
-          <w:color w:val="000000"/>
-          <w:sz w:val="22"/>
-        </w:rPr>
-        <w:t xml:space="preserve">P</w:t>
-      </w:r>
-      <w:r>
-        <w:rPr>
-          <w:rFonts w:ascii="Times New Roman" w:hAnsi="Times New Roman"/>
-          <w:b w:val="0"/>
-          <w:bCs/>
-          <w:color w:val="000000"/>
-          <w:sz w:val="22"/>
-        </w:rPr>
-        <w:t xml:space="preserve"> </w:t>
-      </w:r>
-      <w:r>
-        <w:rPr>
-          <w:rFonts w:ascii="Times New Roman" w:hAnsi="Times New Roman"/>
-          <w:b w:val="0"/>
-          <w:bCs/>
-          <w:color w:val="000000"/>
-          <w:sz w:val="22"/>
-        </w:rPr>
-        <w:t xml:space="preserve">&lt; 0.0001). These findings identify disease-context-dependent remodeling — shared functional themes emerging through distinct network configurations with opposite perturbation directions — as an organizing principle of translation-related transcriptional programs across diseases.</w:t>
+        <w:t xml:space="preserve">Trial registration:</w:t>
+      </w:r>
+      <w:r>
+        <w:rPr>
+          <w:rFonts w:ascii="Times New Roman" w:hAnsi="Times New Roman"/>
+          <w:b w:val="0"/>
+          <w:color w:val="000000"/>
+          <w:sz w:val="22"/>
+        </w:rPr>
+        <w:t xml:space="preserve"> </w:t>
+      </w:r>
+      <w:r>
+        <w:rPr>
+          <w:rFonts w:ascii="Times New Roman" w:hAnsi="Times New Roman"/>
+          <w:b w:val="0"/>
+          <w:color w:val="000000"/>
+          <w:sz w:val="22"/>
+        </w:rPr>
+        <w:t xml:space="preserve">Not applicable.</w:t>
       </w:r>
     </w:p>
     <w:p>

</xml_diff>